<commit_message>
\IT_KNOWLEDGE_BASE\Fair Technical Assessment Framework.pdf 2.2.6 and 2.2.7
</commit_message>
<xml_diff>
--- a/Fair Technical Assessment Framework.docx
+++ b/Fair Technical Assessment Framework.docx
@@ -5,14 +5,14 @@
     <w:p>
       <w:pPr>
         <w:pStyle w:val="NoSpacing"/>
-        <w:jc w:val="both"/>
+        <w:jc w:val="center"/>
         <w:rPr>
           <w:rFonts w:asciiTheme="minorHAnsi" w:hAnsiTheme="minorHAnsi" w:cstheme="minorHAnsi"/>
           <w:b/>
           <w:bCs/>
           <w:color w:val="2F5496" w:themeColor="accent1" w:themeShade="BF"/>
-          <w:sz w:val="44"/>
-          <w:szCs w:val="48"/>
+          <w:sz w:val="56"/>
+          <w:szCs w:val="72"/>
         </w:rPr>
       </w:pPr>
       <w:r>
@@ -21,8 +21,8 @@
           <w:b/>
           <w:bCs/>
           <w:color w:val="2F5496" w:themeColor="accent1" w:themeShade="BF"/>
-          <w:sz w:val="44"/>
-          <w:szCs w:val="48"/>
+          <w:sz w:val="56"/>
+          <w:szCs w:val="72"/>
         </w:rPr>
         <w:t>Fair Technical Assessment</w:t>
       </w:r>
@@ -32,8 +32,8 @@
           <w:b/>
           <w:bCs/>
           <w:color w:val="2F5496" w:themeColor="accent1" w:themeShade="BF"/>
-          <w:sz w:val="44"/>
-          <w:szCs w:val="48"/>
+          <w:sz w:val="56"/>
+          <w:szCs w:val="72"/>
         </w:rPr>
         <w:t>/Technical Interview</w:t>
       </w:r>
@@ -43,8 +43,8 @@
           <w:b/>
           <w:bCs/>
           <w:color w:val="2F5496" w:themeColor="accent1" w:themeShade="BF"/>
-          <w:sz w:val="44"/>
-          <w:szCs w:val="48"/>
+          <w:sz w:val="56"/>
+          <w:szCs w:val="72"/>
         </w:rPr>
         <w:t xml:space="preserve"> Framework</w:t>
       </w:r>
@@ -90,23 +90,45 @@
           <w:szCs w:val="28"/>
           <w:lang w:val="es-CO"/>
         </w:rPr>
-        <w:t xml:space="preserve">Manu Cortés Granados </w:t>
-      </w:r>
-    </w:p>
-    <w:p>
-      <w:pPr>
-        <w:pStyle w:val="NoSpacing"/>
-        <w:jc w:val="both"/>
-        <w:rPr>
-          <w:rFonts w:asciiTheme="minorHAnsi" w:hAnsiTheme="minorHAnsi" w:cstheme="minorHAnsi"/>
+        <w:t>Manu</w:t>
+      </w:r>
+      <w:r>
+        <w:rPr>
+          <w:rFonts w:asciiTheme="minorHAnsi" w:hAnsiTheme="minorHAnsi" w:cstheme="minorHAnsi"/>
+          <w:b/>
+          <w:bCs/>
+          <w:sz w:val="24"/>
+          <w:szCs w:val="28"/>
           <w:lang w:val="es-CO"/>
         </w:rPr>
-      </w:pPr>
-      <w:r>
-        <w:rPr>
-          <w:rFonts w:asciiTheme="minorHAnsi" w:hAnsiTheme="minorHAnsi" w:cstheme="minorHAnsi"/>
+        <w:t>ela</w:t>
+      </w:r>
+      <w:r>
+        <w:rPr>
+          <w:rFonts w:asciiTheme="minorHAnsi" w:hAnsiTheme="minorHAnsi" w:cstheme="minorHAnsi"/>
+          <w:b/>
+          <w:bCs/>
+          <w:sz w:val="24"/>
+          <w:szCs w:val="28"/>
           <w:lang w:val="es-CO"/>
         </w:rPr>
+        <w:t xml:space="preserve"> Cortés Granados </w:t>
+      </w:r>
+    </w:p>
+    <w:p>
+      <w:pPr>
+        <w:pStyle w:val="NoSpacing"/>
+        <w:jc w:val="both"/>
+        <w:rPr>
+          <w:rFonts w:asciiTheme="minorHAnsi" w:hAnsiTheme="minorHAnsi" w:cstheme="minorHAnsi"/>
+          <w:lang w:val="es-CO"/>
+        </w:rPr>
+      </w:pPr>
+      <w:r>
+        <w:rPr>
+          <w:rFonts w:asciiTheme="minorHAnsi" w:hAnsiTheme="minorHAnsi" w:cstheme="minorHAnsi"/>
+          <w:lang w:val="es-CO"/>
+        </w:rPr>
         <w:t>Date:</w:t>
       </w:r>
       <w:r>
@@ -114,30 +136,48 @@
           <w:rFonts w:asciiTheme="minorHAnsi" w:hAnsiTheme="minorHAnsi" w:cstheme="minorHAnsi"/>
           <w:lang w:val="es-CO"/>
         </w:rPr>
-        <w:t xml:space="preserve"> 14 </w:t>
-      </w:r>
-      <w:proofErr w:type="spellStart"/>
+        <w:t xml:space="preserve"> 14 February 2025</w:t>
+      </w:r>
       <w:r>
         <w:rPr>
           <w:rFonts w:asciiTheme="minorHAnsi" w:hAnsiTheme="minorHAnsi" w:cstheme="minorHAnsi"/>
           <w:lang w:val="es-CO"/>
         </w:rPr>
-        <w:t>February</w:t>
-      </w:r>
-      <w:proofErr w:type="spellEnd"/>
-      <w:r>
+        <w:t xml:space="preserve"> -5:00 GMT Bogotá D.C. Colombia</w:t>
+      </w:r>
+    </w:p>
+    <w:p>
+      <w:pPr>
+        <w:pStyle w:val="NoSpacing"/>
+        <w:jc w:val="both"/>
         <w:rPr>
           <w:rFonts w:asciiTheme="minorHAnsi" w:hAnsiTheme="minorHAnsi" w:cstheme="minorHAnsi"/>
           <w:lang w:val="es-CO"/>
         </w:rPr>
-        <w:t xml:space="preserve"> 2025</w:t>
-      </w:r>
-      <w:r>
+      </w:pPr>
+    </w:p>
+    <w:p>
+      <w:pPr>
+        <w:pStyle w:val="NoSpacing"/>
+        <w:jc w:val="both"/>
         <w:rPr>
           <w:rFonts w:asciiTheme="minorHAnsi" w:hAnsiTheme="minorHAnsi" w:cstheme="minorHAnsi"/>
           <w:lang w:val="es-CO"/>
         </w:rPr>
-        <w:t xml:space="preserve"> -5:00 GMT Bogotá D.C. Colombia</w:t>
+      </w:pPr>
+      <w:r>
+        <w:rPr>
+          <w:rFonts w:asciiTheme="minorHAnsi" w:hAnsiTheme="minorHAnsi" w:cstheme="minorHAnsi"/>
+          <w:lang w:val="es-CO"/>
+        </w:rPr>
+        <w:t xml:space="preserve">Updates : 29 April 2025 </w:t>
+      </w:r>
+      <w:r>
+        <w:rPr>
+          <w:rFonts w:asciiTheme="minorHAnsi" w:hAnsiTheme="minorHAnsi" w:cstheme="minorHAnsi"/>
+          <w:lang w:val="es-CO"/>
+        </w:rPr>
+        <w:t>2.2.6 and 2.2.7</w:t>
       </w:r>
     </w:p>
     <w:p>
@@ -238,55 +278,7 @@
         <w:rPr>
           <w:rFonts w:asciiTheme="minorHAnsi" w:hAnsiTheme="minorHAnsi" w:cstheme="minorHAnsi"/>
         </w:rPr>
-        <w:t>w</w:t>
-      </w:r>
-      <w:r>
-        <w:rPr>
-          <w:rFonts w:asciiTheme="minorHAnsi" w:hAnsiTheme="minorHAnsi" w:cstheme="minorHAnsi"/>
-        </w:rPr>
-        <w:t xml:space="preserve">ith great expectations of a happy and prosperous future for </w:t>
-      </w:r>
-      <w:r>
-        <w:rPr>
-          <w:rFonts w:asciiTheme="minorHAnsi" w:hAnsiTheme="minorHAnsi" w:cstheme="minorHAnsi"/>
-        </w:rPr>
-        <w:t>him or herself</w:t>
-      </w:r>
-      <w:r>
-        <w:rPr>
-          <w:rFonts w:asciiTheme="minorHAnsi" w:hAnsiTheme="minorHAnsi" w:cstheme="minorHAnsi"/>
-        </w:rPr>
-        <w:t xml:space="preserve">, </w:t>
-      </w:r>
-      <w:r>
-        <w:rPr>
-          <w:rFonts w:asciiTheme="minorHAnsi" w:hAnsiTheme="minorHAnsi" w:cstheme="minorHAnsi"/>
-        </w:rPr>
-        <w:t>his/her f</w:t>
-      </w:r>
-      <w:r>
-        <w:rPr>
-          <w:rFonts w:asciiTheme="minorHAnsi" w:hAnsiTheme="minorHAnsi" w:cstheme="minorHAnsi"/>
-        </w:rPr>
-        <w:t xml:space="preserve">amily, </w:t>
-      </w:r>
-      <w:r>
-        <w:rPr>
-          <w:rFonts w:asciiTheme="minorHAnsi" w:hAnsiTheme="minorHAnsi" w:cstheme="minorHAnsi"/>
-        </w:rPr>
-        <w:t>his/her</w:t>
-      </w:r>
-      <w:r>
-        <w:rPr>
-          <w:rFonts w:asciiTheme="minorHAnsi" w:hAnsiTheme="minorHAnsi" w:cstheme="minorHAnsi"/>
-        </w:rPr>
-        <w:t xml:space="preserve"> partner, his/her children and his/her acquaintances.</w:t>
-      </w:r>
-      <w:r>
-        <w:rPr>
-          <w:rFonts w:asciiTheme="minorHAnsi" w:hAnsiTheme="minorHAnsi" w:cstheme="minorHAnsi"/>
-        </w:rPr>
-        <w:t xml:space="preserve"> of doing</w:t>
+        <w:t>with great expectations of a happy and prosperous future for him or herself, his/her family, his/her partner, his/her children and his/her acquaintances. of doing</w:t>
       </w:r>
       <w:r>
         <w:rPr>
@@ -621,14 +613,7 @@
         <w:rPr>
           <w:rFonts w:asciiTheme="minorHAnsi" w:hAnsiTheme="minorHAnsi" w:cstheme="minorHAnsi"/>
         </w:rPr>
-        <w:t xml:space="preserve">Therefore, it is crucial that technical interviews and assessments uphold ethical standards, avoid dehumanizing or subjective scrutiny based on personal feelings and impressions, and focus on evaluating true competencies without </w:t>
-      </w:r>
-      <w:r>
-        <w:rPr>
-          <w:rFonts w:asciiTheme="minorHAnsi" w:hAnsiTheme="minorHAnsi" w:cstheme="minorHAnsi"/>
-        </w:rPr>
-        <w:lastRenderedPageBreak/>
-        <w:t>unjust practices. Companies must recognize that hiring is not just about selecting the "best" candidate but about fostering a fair, respectful, and inclusive process that values the dignity, contributions, and potential of every professional.</w:t>
+        <w:t>Therefore, it is crucial that technical interviews and assessments uphold ethical standards, avoid dehumanizing or subjective scrutiny based on personal feelings and impressions, and focus on evaluating true competencies without unjust practices. Companies must recognize that hiring is not just about selecting the "best" candidate but about fostering a fair, respectful, and inclusive process that values the dignity, contributions, and potential of every professional.</w:t>
       </w:r>
     </w:p>
     <w:p>
@@ -683,17 +668,7 @@
           <w:bCs/>
           <w:color w:val="7E0000"/>
         </w:rPr>
-        <w:t>E</w:t>
-      </w:r>
-      <w:r>
-        <w:rPr>
-          <w:rStyle w:val="Strong"/>
-          <w:rFonts w:asciiTheme="minorHAnsi" w:hAnsiTheme="minorHAnsi" w:cstheme="minorHAnsi"/>
-          <w:b/>
-          <w:bCs/>
-          <w:color w:val="7E0000"/>
-        </w:rPr>
-        <w:t>thical Principles from Major Religions on Justice and Fairness in Assessments</w:t>
+        <w:t>Ethical Principles from Major Religions on Justice and Fairness in Assessments</w:t>
       </w:r>
     </w:p>
     <w:p>
@@ -1207,21 +1182,12 @@
           <w:rFonts w:asciiTheme="minorHAnsi" w:hAnsiTheme="minorHAnsi" w:cstheme="minorHAnsi"/>
         </w:rPr>
       </w:pPr>
-      <w:proofErr w:type="spellStart"/>
       <w:r>
         <w:rPr>
           <w:rStyle w:val="Emphasis"/>
           <w:rFonts w:asciiTheme="minorHAnsi" w:hAnsiTheme="minorHAnsi" w:cstheme="minorHAnsi"/>
         </w:rPr>
-        <w:t>Sigalovada</w:t>
-      </w:r>
-      <w:proofErr w:type="spellEnd"/>
-      <w:r>
-        <w:rPr>
-          <w:rStyle w:val="Emphasis"/>
-          <w:rFonts w:asciiTheme="minorHAnsi" w:hAnsiTheme="minorHAnsi" w:cstheme="minorHAnsi"/>
-        </w:rPr>
-        <w:t xml:space="preserve"> Sutta</w:t>
+        <w:t>Sigalovada Sutta</w:t>
       </w:r>
       <w:r>
         <w:rPr>
@@ -1286,23 +1252,7 @@
           <w:rStyle w:val="Emphasis"/>
           <w:rFonts w:asciiTheme="minorHAnsi" w:hAnsiTheme="minorHAnsi" w:cstheme="minorHAnsi"/>
         </w:rPr>
-        <w:t xml:space="preserve">Guru </w:t>
-      </w:r>
-      <w:proofErr w:type="spellStart"/>
-      <w:r>
-        <w:rPr>
-          <w:rStyle w:val="Emphasis"/>
-          <w:rFonts w:asciiTheme="minorHAnsi" w:hAnsiTheme="minorHAnsi" w:cstheme="minorHAnsi"/>
-        </w:rPr>
-        <w:t>Granth</w:t>
-      </w:r>
-      <w:proofErr w:type="spellEnd"/>
-      <w:r>
-        <w:rPr>
-          <w:rStyle w:val="Emphasis"/>
-          <w:rFonts w:asciiTheme="minorHAnsi" w:hAnsiTheme="minorHAnsi" w:cstheme="minorHAnsi"/>
-        </w:rPr>
-        <w:t xml:space="preserve"> Sahib, Ang 1245</w:t>
+        <w:t>Guru Granth Sahib, Ang 1245</w:t>
       </w:r>
       <w:r>
         <w:rPr>
@@ -1595,7 +1545,6 @@
           <w:rFonts w:asciiTheme="minorHAnsi" w:hAnsiTheme="minorHAnsi" w:cstheme="minorHAnsi"/>
         </w:rPr>
       </w:pPr>
-      <w:proofErr w:type="spellStart"/>
       <w:r>
         <w:rPr>
           <w:rStyle w:val="Emphasis"/>
@@ -1603,7 +1552,6 @@
         </w:rPr>
         <w:t>Kojiki</w:t>
       </w:r>
-      <w:proofErr w:type="spellEnd"/>
       <w:r>
         <w:rPr>
           <w:rFonts w:asciiTheme="minorHAnsi" w:hAnsiTheme="minorHAnsi" w:cstheme="minorHAnsi"/>
@@ -2367,6 +2315,991 @@
           <w:rFonts w:asciiTheme="minorHAnsi" w:hAnsiTheme="minorHAnsi" w:cstheme="minorHAnsi"/>
           <w:b/>
           <w:bCs/>
+          <w:sz w:val="24"/>
+          <w:szCs w:val="28"/>
+        </w:rPr>
+      </w:pPr>
+      <w:r>
+        <w:rPr>
+          <w:rFonts w:asciiTheme="minorHAnsi" w:hAnsiTheme="minorHAnsi" w:cstheme="minorHAnsi"/>
+          <w:b/>
+          <w:bCs/>
+          <w:sz w:val="24"/>
+          <w:szCs w:val="28"/>
+        </w:rPr>
+        <w:t>Article 2.2.</w:t>
+      </w:r>
+      <w:r>
+        <w:rPr>
+          <w:rFonts w:asciiTheme="minorHAnsi" w:hAnsiTheme="minorHAnsi" w:cstheme="minorHAnsi"/>
+          <w:b/>
+          <w:bCs/>
+          <w:sz w:val="24"/>
+          <w:szCs w:val="28"/>
+        </w:rPr>
+        <w:t>6</w:t>
+      </w:r>
+      <w:r>
+        <w:rPr>
+          <w:rFonts w:asciiTheme="minorHAnsi" w:hAnsiTheme="minorHAnsi" w:cstheme="minorHAnsi"/>
+          <w:b/>
+          <w:bCs/>
+          <w:sz w:val="24"/>
+          <w:szCs w:val="28"/>
+        </w:rPr>
+        <w:t>:</w:t>
+      </w:r>
+      <w:r>
+        <w:rPr>
+          <w:rFonts w:asciiTheme="minorHAnsi" w:hAnsiTheme="minorHAnsi" w:cstheme="minorHAnsi"/>
+          <w:b/>
+          <w:bCs/>
+          <w:sz w:val="24"/>
+          <w:szCs w:val="28"/>
+        </w:rPr>
+        <w:t xml:space="preserve"> </w:t>
+      </w:r>
+      <w:r>
+        <w:rPr>
+          <w:rFonts w:asciiTheme="minorHAnsi" w:hAnsiTheme="minorHAnsi" w:cstheme="minorHAnsi"/>
+          <w:b/>
+          <w:bCs/>
+          <w:sz w:val="24"/>
+          <w:szCs w:val="28"/>
+        </w:rPr>
+        <w:t>Interview Report Transparency</w:t>
+      </w:r>
+    </w:p>
+    <w:p>
+      <w:pPr>
+        <w:pStyle w:val="NoSpacing"/>
+        <w:jc w:val="both"/>
+        <w:rPr>
+          <w:rFonts w:asciiTheme="minorHAnsi" w:hAnsiTheme="minorHAnsi" w:cstheme="minorHAnsi"/>
+          <w:b/>
+          <w:bCs/>
+        </w:rPr>
+      </w:pPr>
+    </w:p>
+    <w:p>
+      <w:pPr>
+        <w:pStyle w:val="NoSpacing"/>
+        <w:jc w:val="both"/>
+        <w:rPr>
+          <w:rFonts w:asciiTheme="minorHAnsi" w:hAnsiTheme="minorHAnsi" w:cstheme="minorHAnsi"/>
+          <w:b/>
+          <w:bCs/>
+        </w:rPr>
+      </w:pPr>
+      <w:r>
+        <w:rPr>
+          <w:rFonts w:asciiTheme="minorHAnsi" w:hAnsiTheme="minorHAnsi" w:cstheme="minorHAnsi"/>
+          <w:b/>
+          <w:bCs/>
+        </w:rPr>
+        <w:t xml:space="preserve">2.2.6.1. </w:t>
+      </w:r>
+      <w:r>
+        <w:rPr>
+          <w:rFonts w:asciiTheme="minorHAnsi" w:hAnsiTheme="minorHAnsi" w:cstheme="minorHAnsi"/>
+          <w:b/>
+          <w:bCs/>
+        </w:rPr>
+        <w:t>Purpose:</w:t>
+      </w:r>
+    </w:p>
+    <w:p>
+      <w:pPr>
+        <w:pStyle w:val="NoSpacing"/>
+        <w:jc w:val="both"/>
+        <w:rPr>
+          <w:rFonts w:asciiTheme="minorHAnsi" w:hAnsiTheme="minorHAnsi" w:cstheme="minorHAnsi"/>
+        </w:rPr>
+      </w:pPr>
+      <w:r>
+        <w:rPr>
+          <w:rFonts w:asciiTheme="minorHAnsi" w:hAnsiTheme="minorHAnsi" w:cstheme="minorHAnsi"/>
+        </w:rPr>
+        <w:t>To promote fairness, accountability, and transparency in technical interviews and assessments.</w:t>
+      </w:r>
+    </w:p>
+    <w:p>
+      <w:pPr>
+        <w:pStyle w:val="NoSpacing"/>
+        <w:jc w:val="both"/>
+        <w:rPr>
+          <w:rFonts w:asciiTheme="minorHAnsi" w:hAnsiTheme="minorHAnsi" w:cstheme="minorHAnsi"/>
+        </w:rPr>
+      </w:pPr>
+    </w:p>
+    <w:p>
+      <w:pPr>
+        <w:pStyle w:val="NoSpacing"/>
+        <w:jc w:val="both"/>
+        <w:rPr>
+          <w:rFonts w:asciiTheme="minorHAnsi" w:hAnsiTheme="minorHAnsi" w:cstheme="minorHAnsi"/>
+          <w:b/>
+          <w:bCs/>
+        </w:rPr>
+      </w:pPr>
+      <w:r>
+        <w:rPr>
+          <w:rFonts w:asciiTheme="minorHAnsi" w:hAnsiTheme="minorHAnsi" w:cstheme="minorHAnsi"/>
+          <w:b/>
+          <w:bCs/>
+        </w:rPr>
+        <w:t xml:space="preserve">2.2.6.2. </w:t>
+      </w:r>
+      <w:r>
+        <w:rPr>
+          <w:rFonts w:asciiTheme="minorHAnsi" w:hAnsiTheme="minorHAnsi" w:cstheme="minorHAnsi"/>
+          <w:b/>
+          <w:bCs/>
+        </w:rPr>
+        <w:t>Policy:</w:t>
+      </w:r>
+    </w:p>
+    <w:p>
+      <w:pPr>
+        <w:pStyle w:val="NoSpacing"/>
+        <w:jc w:val="both"/>
+        <w:rPr>
+          <w:rFonts w:asciiTheme="minorHAnsi" w:hAnsiTheme="minorHAnsi" w:cstheme="minorHAnsi"/>
+        </w:rPr>
+      </w:pPr>
+      <w:r>
+        <w:rPr>
+          <w:rFonts w:asciiTheme="minorHAnsi" w:hAnsiTheme="minorHAnsi" w:cstheme="minorHAnsi"/>
+        </w:rPr>
+        <w:t>After each technical interview or assessment, the evaluator must prepare a comprehensive interview report. This report must include:</w:t>
+      </w:r>
+    </w:p>
+    <w:p>
+      <w:pPr>
+        <w:pStyle w:val="NoSpacing"/>
+        <w:jc w:val="both"/>
+        <w:rPr>
+          <w:rFonts w:asciiTheme="minorHAnsi" w:hAnsiTheme="minorHAnsi" w:cstheme="minorHAnsi"/>
+        </w:rPr>
+      </w:pPr>
+    </w:p>
+    <w:p>
+      <w:pPr>
+        <w:pStyle w:val="NoSpacing"/>
+        <w:jc w:val="both"/>
+        <w:rPr>
+          <w:rFonts w:asciiTheme="minorHAnsi" w:hAnsiTheme="minorHAnsi" w:cstheme="minorHAnsi"/>
+          <w:b/>
+          <w:bCs/>
+        </w:rPr>
+      </w:pPr>
+      <w:r>
+        <w:rPr>
+          <w:rFonts w:asciiTheme="minorHAnsi" w:hAnsiTheme="minorHAnsi" w:cstheme="minorHAnsi"/>
+          <w:b/>
+          <w:bCs/>
+        </w:rPr>
+        <w:t xml:space="preserve">2.2.6.2.1. </w:t>
+      </w:r>
+      <w:r>
+        <w:rPr>
+          <w:rFonts w:asciiTheme="minorHAnsi" w:hAnsiTheme="minorHAnsi" w:cstheme="minorHAnsi"/>
+          <w:b/>
+          <w:bCs/>
+        </w:rPr>
+        <w:t>Full List of Questions Asked:</w:t>
+      </w:r>
+    </w:p>
+    <w:p>
+      <w:pPr>
+        <w:pStyle w:val="NoSpacing"/>
+        <w:jc w:val="both"/>
+        <w:rPr>
+          <w:rFonts w:asciiTheme="minorHAnsi" w:hAnsiTheme="minorHAnsi" w:cstheme="minorHAnsi"/>
+        </w:rPr>
+      </w:pPr>
+      <w:r>
+        <w:rPr>
+          <w:rFonts w:asciiTheme="minorHAnsi" w:hAnsiTheme="minorHAnsi" w:cstheme="minorHAnsi"/>
+        </w:rPr>
+        <w:t>A clear and complete record of all technical, behavioral, or situational questions posed to the candidate during the session.</w:t>
+      </w:r>
+    </w:p>
+    <w:p>
+      <w:pPr>
+        <w:pStyle w:val="NoSpacing"/>
+        <w:jc w:val="both"/>
+        <w:rPr>
+          <w:rFonts w:asciiTheme="minorHAnsi" w:hAnsiTheme="minorHAnsi" w:cstheme="minorHAnsi"/>
+        </w:rPr>
+      </w:pPr>
+    </w:p>
+    <w:p>
+      <w:pPr>
+        <w:pStyle w:val="NoSpacing"/>
+        <w:jc w:val="both"/>
+        <w:rPr>
+          <w:rFonts w:asciiTheme="minorHAnsi" w:hAnsiTheme="minorHAnsi" w:cstheme="minorHAnsi"/>
+          <w:b/>
+          <w:bCs/>
+        </w:rPr>
+      </w:pPr>
+      <w:r>
+        <w:rPr>
+          <w:rFonts w:asciiTheme="minorHAnsi" w:hAnsiTheme="minorHAnsi" w:cstheme="minorHAnsi"/>
+          <w:b/>
+          <w:bCs/>
+        </w:rPr>
+        <w:t xml:space="preserve">2.2.6.2.2. </w:t>
+      </w:r>
+      <w:r>
+        <w:rPr>
+          <w:rFonts w:asciiTheme="minorHAnsi" w:hAnsiTheme="minorHAnsi" w:cstheme="minorHAnsi"/>
+          <w:b/>
+          <w:bCs/>
+        </w:rPr>
+        <w:t>Candidate’s Responses:</w:t>
+      </w:r>
+    </w:p>
+    <w:p>
+      <w:pPr>
+        <w:pStyle w:val="NoSpacing"/>
+        <w:jc w:val="both"/>
+        <w:rPr>
+          <w:rFonts w:asciiTheme="minorHAnsi" w:hAnsiTheme="minorHAnsi" w:cstheme="minorHAnsi"/>
+        </w:rPr>
+      </w:pPr>
+      <w:r>
+        <w:rPr>
+          <w:rFonts w:asciiTheme="minorHAnsi" w:hAnsiTheme="minorHAnsi" w:cstheme="minorHAnsi"/>
+        </w:rPr>
+        <w:t>A written summary or transcript (where applicable) of the answers given by the candidate, including code snippets, system design sketches, or verbal explanations.</w:t>
+      </w:r>
+    </w:p>
+    <w:p>
+      <w:pPr>
+        <w:pStyle w:val="NoSpacing"/>
+        <w:jc w:val="both"/>
+        <w:rPr>
+          <w:rFonts w:asciiTheme="minorHAnsi" w:hAnsiTheme="minorHAnsi" w:cstheme="minorHAnsi"/>
+        </w:rPr>
+      </w:pPr>
+    </w:p>
+    <w:p>
+      <w:pPr>
+        <w:pStyle w:val="NoSpacing"/>
+        <w:jc w:val="both"/>
+        <w:rPr>
+          <w:rFonts w:asciiTheme="minorHAnsi" w:hAnsiTheme="minorHAnsi" w:cstheme="minorHAnsi"/>
+          <w:b/>
+          <w:bCs/>
+        </w:rPr>
+      </w:pPr>
+      <w:r>
+        <w:rPr>
+          <w:rFonts w:asciiTheme="minorHAnsi" w:hAnsiTheme="minorHAnsi" w:cstheme="minorHAnsi"/>
+          <w:b/>
+          <w:bCs/>
+        </w:rPr>
+        <w:t xml:space="preserve">2.2.6.2.3. </w:t>
+      </w:r>
+      <w:r>
+        <w:rPr>
+          <w:rFonts w:asciiTheme="minorHAnsi" w:hAnsiTheme="minorHAnsi" w:cstheme="minorHAnsi"/>
+          <w:b/>
+          <w:bCs/>
+        </w:rPr>
+        <w:t>Evaluation Notes (Optional for Candidate):</w:t>
+      </w:r>
+    </w:p>
+    <w:p>
+      <w:pPr>
+        <w:pStyle w:val="NoSpacing"/>
+        <w:jc w:val="both"/>
+        <w:rPr>
+          <w:rFonts w:asciiTheme="minorHAnsi" w:hAnsiTheme="minorHAnsi" w:cstheme="minorHAnsi"/>
+        </w:rPr>
+      </w:pPr>
+      <w:r>
+        <w:rPr>
+          <w:rFonts w:asciiTheme="minorHAnsi" w:hAnsiTheme="minorHAnsi" w:cstheme="minorHAnsi"/>
+        </w:rPr>
+        <w:t>Internal evaluator comments can be included for HR purposes but should be shared with the candidate only if phrased constructively and respectfully.</w:t>
+      </w:r>
+    </w:p>
+    <w:p>
+      <w:pPr>
+        <w:pStyle w:val="NoSpacing"/>
+        <w:jc w:val="both"/>
+        <w:rPr>
+          <w:rFonts w:asciiTheme="minorHAnsi" w:hAnsiTheme="minorHAnsi" w:cstheme="minorHAnsi"/>
+        </w:rPr>
+      </w:pPr>
+    </w:p>
+    <w:p>
+      <w:pPr>
+        <w:pStyle w:val="NoSpacing"/>
+        <w:jc w:val="both"/>
+        <w:rPr>
+          <w:rFonts w:asciiTheme="minorHAnsi" w:hAnsiTheme="minorHAnsi" w:cstheme="minorHAnsi"/>
+          <w:b/>
+          <w:bCs/>
+        </w:rPr>
+      </w:pPr>
+      <w:r>
+        <w:rPr>
+          <w:rFonts w:asciiTheme="minorHAnsi" w:hAnsiTheme="minorHAnsi" w:cstheme="minorHAnsi"/>
+          <w:b/>
+          <w:bCs/>
+        </w:rPr>
+        <w:lastRenderedPageBreak/>
+        <w:t xml:space="preserve">2.2.6.2.4. </w:t>
+      </w:r>
+      <w:r>
+        <w:rPr>
+          <w:rFonts w:asciiTheme="minorHAnsi" w:hAnsiTheme="minorHAnsi" w:cstheme="minorHAnsi"/>
+          <w:b/>
+          <w:bCs/>
+        </w:rPr>
+        <w:t>HR Transmission:</w:t>
+      </w:r>
+    </w:p>
+    <w:p>
+      <w:pPr>
+        <w:pStyle w:val="NoSpacing"/>
+        <w:jc w:val="both"/>
+        <w:rPr>
+          <w:rFonts w:asciiTheme="minorHAnsi" w:hAnsiTheme="minorHAnsi" w:cstheme="minorHAnsi"/>
+        </w:rPr>
+      </w:pPr>
+      <w:r>
+        <w:rPr>
+          <w:rFonts w:asciiTheme="minorHAnsi" w:hAnsiTheme="minorHAnsi" w:cstheme="minorHAnsi"/>
+        </w:rPr>
+        <w:t>HR is responsible for sending this report to the candidate at the time of delivering feedback—regardless of the outcome (selected or not selected). This ensures candidates have full visibility into how their performance was assessed.</w:t>
+      </w:r>
+    </w:p>
+    <w:p>
+      <w:pPr>
+        <w:pStyle w:val="NoSpacing"/>
+        <w:jc w:val="both"/>
+        <w:rPr>
+          <w:rFonts w:asciiTheme="minorHAnsi" w:hAnsiTheme="minorHAnsi" w:cstheme="minorHAnsi"/>
+        </w:rPr>
+      </w:pPr>
+    </w:p>
+    <w:p>
+      <w:pPr>
+        <w:pStyle w:val="NoSpacing"/>
+        <w:jc w:val="both"/>
+        <w:rPr>
+          <w:rFonts w:asciiTheme="minorHAnsi" w:hAnsiTheme="minorHAnsi" w:cstheme="minorHAnsi"/>
+          <w:b/>
+          <w:bCs/>
+        </w:rPr>
+      </w:pPr>
+      <w:r>
+        <w:rPr>
+          <w:rFonts w:asciiTheme="minorHAnsi" w:hAnsiTheme="minorHAnsi" w:cstheme="minorHAnsi"/>
+          <w:b/>
+          <w:bCs/>
+        </w:rPr>
+        <w:t xml:space="preserve">2.2.6.2.5. </w:t>
+      </w:r>
+      <w:r>
+        <w:rPr>
+          <w:rFonts w:asciiTheme="minorHAnsi" w:hAnsiTheme="minorHAnsi" w:cstheme="minorHAnsi"/>
+          <w:b/>
+          <w:bCs/>
+        </w:rPr>
+        <w:t>Rationale:</w:t>
+      </w:r>
+    </w:p>
+    <w:p>
+      <w:pPr>
+        <w:pStyle w:val="NoSpacing"/>
+        <w:jc w:val="both"/>
+        <w:rPr>
+          <w:rFonts w:asciiTheme="minorHAnsi" w:hAnsiTheme="minorHAnsi" w:cstheme="minorHAnsi"/>
+        </w:rPr>
+      </w:pPr>
+      <w:r>
+        <w:rPr>
+          <w:rFonts w:asciiTheme="minorHAnsi" w:hAnsiTheme="minorHAnsi" w:cstheme="minorHAnsi"/>
+        </w:rPr>
+        <w:t>This process reinforces trust in the hiring process, empowers candidates with clarity on their evaluation, and protects the company from claims of bias or unprofessionalism.</w:t>
+      </w:r>
+    </w:p>
+    <w:p>
+      <w:pPr>
+        <w:pStyle w:val="NoSpacing"/>
+        <w:jc w:val="both"/>
+        <w:rPr>
+          <w:rFonts w:asciiTheme="minorHAnsi" w:hAnsiTheme="minorHAnsi" w:cstheme="minorHAnsi"/>
+        </w:rPr>
+      </w:pPr>
+    </w:p>
+    <w:p>
+      <w:pPr>
+        <w:pStyle w:val="NoSpacing"/>
+        <w:jc w:val="both"/>
+        <w:rPr>
+          <w:rFonts w:asciiTheme="minorHAnsi" w:hAnsiTheme="minorHAnsi" w:cstheme="minorHAnsi"/>
+          <w:b/>
+          <w:bCs/>
+          <w:sz w:val="24"/>
+          <w:szCs w:val="28"/>
+        </w:rPr>
+      </w:pPr>
+      <w:r>
+        <w:rPr>
+          <w:rFonts w:asciiTheme="minorHAnsi" w:hAnsiTheme="minorHAnsi" w:cstheme="minorHAnsi"/>
+          <w:b/>
+          <w:bCs/>
+          <w:sz w:val="24"/>
+          <w:szCs w:val="28"/>
+        </w:rPr>
+        <w:t xml:space="preserve">Article </w:t>
+      </w:r>
+      <w:r>
+        <w:rPr>
+          <w:rFonts w:asciiTheme="minorHAnsi" w:hAnsiTheme="minorHAnsi" w:cstheme="minorHAnsi"/>
+          <w:b/>
+          <w:bCs/>
+          <w:sz w:val="24"/>
+          <w:szCs w:val="28"/>
+        </w:rPr>
+        <w:t>2.2.7</w:t>
+      </w:r>
+      <w:r>
+        <w:rPr>
+          <w:rFonts w:asciiTheme="minorHAnsi" w:hAnsiTheme="minorHAnsi" w:cstheme="minorHAnsi"/>
+          <w:b/>
+          <w:bCs/>
+          <w:sz w:val="24"/>
+          <w:szCs w:val="28"/>
+        </w:rPr>
+        <w:t>: Candidate Right to Use Personal AI Notes or Record Session</w:t>
+      </w:r>
+    </w:p>
+    <w:p>
+      <w:pPr>
+        <w:pStyle w:val="NoSpacing"/>
+        <w:jc w:val="both"/>
+        <w:rPr>
+          <w:rFonts w:asciiTheme="minorHAnsi" w:hAnsiTheme="minorHAnsi" w:cstheme="minorHAnsi"/>
+        </w:rPr>
+      </w:pPr>
+    </w:p>
+    <w:p>
+      <w:pPr>
+        <w:pStyle w:val="NoSpacing"/>
+        <w:jc w:val="both"/>
+        <w:rPr>
+          <w:rFonts w:asciiTheme="minorHAnsi" w:hAnsiTheme="minorHAnsi" w:cstheme="minorHAnsi"/>
+          <w:b/>
+          <w:bCs/>
+        </w:rPr>
+      </w:pPr>
+      <w:r>
+        <w:rPr>
+          <w:rFonts w:asciiTheme="minorHAnsi" w:hAnsiTheme="minorHAnsi" w:cstheme="minorHAnsi"/>
+          <w:b/>
+          <w:bCs/>
+        </w:rPr>
+        <w:t xml:space="preserve">2.2.7.1. </w:t>
+      </w:r>
+      <w:r>
+        <w:rPr>
+          <w:rFonts w:asciiTheme="minorHAnsi" w:hAnsiTheme="minorHAnsi" w:cstheme="minorHAnsi"/>
+          <w:b/>
+          <w:bCs/>
+        </w:rPr>
+        <w:t>Purpose:</w:t>
+      </w:r>
+    </w:p>
+    <w:p>
+      <w:pPr>
+        <w:pStyle w:val="NoSpacing"/>
+        <w:jc w:val="both"/>
+        <w:rPr>
+          <w:rFonts w:asciiTheme="minorHAnsi" w:hAnsiTheme="minorHAnsi" w:cstheme="minorHAnsi"/>
+        </w:rPr>
+      </w:pPr>
+      <w:r>
+        <w:rPr>
+          <w:rFonts w:asciiTheme="minorHAnsi" w:hAnsiTheme="minorHAnsi" w:cstheme="minorHAnsi"/>
+        </w:rPr>
+        <w:t>To ensure candidates have fair and equal opportunity to demonstrate their capabilities and retain access to their thought process and responses.</w:t>
+      </w:r>
+    </w:p>
+    <w:p>
+      <w:pPr>
+        <w:pStyle w:val="NoSpacing"/>
+        <w:jc w:val="both"/>
+        <w:rPr>
+          <w:rFonts w:asciiTheme="minorHAnsi" w:hAnsiTheme="minorHAnsi" w:cstheme="minorHAnsi"/>
+        </w:rPr>
+      </w:pPr>
+    </w:p>
+    <w:p>
+      <w:pPr>
+        <w:pStyle w:val="NoSpacing"/>
+        <w:jc w:val="both"/>
+        <w:rPr>
+          <w:rFonts w:asciiTheme="minorHAnsi" w:hAnsiTheme="minorHAnsi" w:cstheme="minorHAnsi"/>
+          <w:b/>
+          <w:bCs/>
+        </w:rPr>
+      </w:pPr>
+      <w:r>
+        <w:rPr>
+          <w:rFonts w:asciiTheme="minorHAnsi" w:hAnsiTheme="minorHAnsi" w:cstheme="minorHAnsi"/>
+          <w:b/>
+          <w:bCs/>
+        </w:rPr>
+        <w:t xml:space="preserve">2.2.7.2. </w:t>
+      </w:r>
+      <w:r>
+        <w:rPr>
+          <w:rFonts w:asciiTheme="minorHAnsi" w:hAnsiTheme="minorHAnsi" w:cstheme="minorHAnsi"/>
+          <w:b/>
+          <w:bCs/>
+        </w:rPr>
+        <w:t>Policy:</w:t>
+      </w:r>
+    </w:p>
+    <w:p>
+      <w:pPr>
+        <w:pStyle w:val="NoSpacing"/>
+        <w:jc w:val="both"/>
+        <w:rPr>
+          <w:rFonts w:asciiTheme="minorHAnsi" w:hAnsiTheme="minorHAnsi" w:cstheme="minorHAnsi"/>
+        </w:rPr>
+      </w:pPr>
+    </w:p>
+    <w:p>
+      <w:pPr>
+        <w:pStyle w:val="NoSpacing"/>
+        <w:jc w:val="both"/>
+        <w:rPr>
+          <w:rFonts w:asciiTheme="minorHAnsi" w:hAnsiTheme="minorHAnsi" w:cstheme="minorHAnsi"/>
+          <w:b/>
+          <w:bCs/>
+        </w:rPr>
+      </w:pPr>
+      <w:r>
+        <w:rPr>
+          <w:rFonts w:asciiTheme="minorHAnsi" w:hAnsiTheme="minorHAnsi" w:cstheme="minorHAnsi"/>
+          <w:b/>
+          <w:bCs/>
+        </w:rPr>
+        <w:t xml:space="preserve">2.2.7.2.1. </w:t>
+      </w:r>
+      <w:r>
+        <w:rPr>
+          <w:rFonts w:asciiTheme="minorHAnsi" w:hAnsiTheme="minorHAnsi" w:cstheme="minorHAnsi"/>
+          <w:b/>
+          <w:bCs/>
+        </w:rPr>
+        <w:t>Use of Personal AI Notes or Tools:</w:t>
+      </w:r>
+    </w:p>
+    <w:p>
+      <w:pPr>
+        <w:pStyle w:val="NoSpacing"/>
+        <w:jc w:val="both"/>
+        <w:rPr>
+          <w:rFonts w:asciiTheme="minorHAnsi" w:hAnsiTheme="minorHAnsi" w:cstheme="minorHAnsi"/>
+          <w:b/>
+          <w:bCs/>
+        </w:rPr>
+      </w:pPr>
+    </w:p>
+    <w:p>
+      <w:pPr>
+        <w:pStyle w:val="NoSpacing"/>
+        <w:jc w:val="both"/>
+        <w:rPr>
+          <w:rFonts w:asciiTheme="minorHAnsi" w:hAnsiTheme="minorHAnsi" w:cstheme="minorHAnsi"/>
+        </w:rPr>
+      </w:pPr>
+      <w:r>
+        <w:rPr>
+          <w:rFonts w:asciiTheme="minorHAnsi" w:hAnsiTheme="minorHAnsi" w:cstheme="minorHAnsi"/>
+        </w:rPr>
+        <w:t>Candidates are allowed to use their own AI-powered notes or personal digital assistants (e.g., note-taking apps, summarization tools, context-aware memory tools) during the interview, as long as:</w:t>
+      </w:r>
+    </w:p>
+    <w:p>
+      <w:pPr>
+        <w:pStyle w:val="NoSpacing"/>
+        <w:jc w:val="both"/>
+        <w:rPr>
+          <w:rFonts w:asciiTheme="minorHAnsi" w:hAnsiTheme="minorHAnsi" w:cstheme="minorHAnsi"/>
+        </w:rPr>
+      </w:pPr>
+    </w:p>
+    <w:p>
+      <w:pPr>
+        <w:pStyle w:val="NoSpacing"/>
+        <w:numPr>
+          <w:ilvl w:val="0"/>
+          <w:numId w:val="16"/>
+        </w:numPr>
+        <w:jc w:val="both"/>
+        <w:rPr>
+          <w:rFonts w:asciiTheme="minorHAnsi" w:hAnsiTheme="minorHAnsi" w:cstheme="minorHAnsi"/>
+        </w:rPr>
+      </w:pPr>
+      <w:r>
+        <w:rPr>
+          <w:rFonts w:asciiTheme="minorHAnsi" w:hAnsiTheme="minorHAnsi" w:cstheme="minorHAnsi"/>
+        </w:rPr>
+        <w:t>The tools are managed by the candidate.</w:t>
+      </w:r>
+    </w:p>
+    <w:p>
+      <w:pPr>
+        <w:pStyle w:val="NoSpacing"/>
+        <w:jc w:val="both"/>
+        <w:rPr>
+          <w:rFonts w:asciiTheme="minorHAnsi" w:hAnsiTheme="minorHAnsi" w:cstheme="minorHAnsi"/>
+        </w:rPr>
+      </w:pPr>
+    </w:p>
+    <w:p>
+      <w:pPr>
+        <w:pStyle w:val="NoSpacing"/>
+        <w:numPr>
+          <w:ilvl w:val="0"/>
+          <w:numId w:val="16"/>
+        </w:numPr>
+        <w:jc w:val="both"/>
+        <w:rPr>
+          <w:rFonts w:asciiTheme="minorHAnsi" w:hAnsiTheme="minorHAnsi" w:cstheme="minorHAnsi"/>
+        </w:rPr>
+      </w:pPr>
+      <w:r>
+        <w:rPr>
+          <w:rFonts w:asciiTheme="minorHAnsi" w:hAnsiTheme="minorHAnsi" w:cstheme="minorHAnsi"/>
+        </w:rPr>
+        <w:t>The tools do not involve real-time external assistance (e.g., live chat with LLMs or human tutors).</w:t>
+      </w:r>
+    </w:p>
+    <w:p>
+      <w:pPr>
+        <w:pStyle w:val="NoSpacing"/>
+        <w:jc w:val="both"/>
+        <w:rPr>
+          <w:rFonts w:asciiTheme="minorHAnsi" w:hAnsiTheme="minorHAnsi" w:cstheme="minorHAnsi"/>
+        </w:rPr>
+      </w:pPr>
+    </w:p>
+    <w:p>
+      <w:pPr>
+        <w:pStyle w:val="NoSpacing"/>
+        <w:numPr>
+          <w:ilvl w:val="0"/>
+          <w:numId w:val="16"/>
+        </w:numPr>
+        <w:jc w:val="both"/>
+        <w:rPr>
+          <w:rFonts w:asciiTheme="minorHAnsi" w:hAnsiTheme="minorHAnsi" w:cstheme="minorHAnsi"/>
+        </w:rPr>
+      </w:pPr>
+      <w:r>
+        <w:rPr>
+          <w:rFonts w:asciiTheme="minorHAnsi" w:hAnsiTheme="minorHAnsi" w:cstheme="minorHAnsi"/>
+        </w:rPr>
+        <w:t>Usage is disclosed at the beginning of the session if required by company policy.</w:t>
+      </w:r>
+    </w:p>
+    <w:p>
+      <w:pPr>
+        <w:pStyle w:val="NoSpacing"/>
+        <w:jc w:val="both"/>
+        <w:rPr>
+          <w:rFonts w:asciiTheme="minorHAnsi" w:hAnsiTheme="minorHAnsi" w:cstheme="minorHAnsi"/>
+        </w:rPr>
+      </w:pPr>
+    </w:p>
+    <w:p>
+      <w:pPr>
+        <w:pStyle w:val="NoSpacing"/>
+        <w:jc w:val="both"/>
+        <w:rPr>
+          <w:rFonts w:asciiTheme="minorHAnsi" w:hAnsiTheme="minorHAnsi" w:cstheme="minorHAnsi"/>
+          <w:b/>
+          <w:bCs/>
+        </w:rPr>
+      </w:pPr>
+      <w:r>
+        <w:rPr>
+          <w:rFonts w:asciiTheme="minorHAnsi" w:hAnsiTheme="minorHAnsi" w:cstheme="minorHAnsi"/>
+          <w:b/>
+          <w:bCs/>
+        </w:rPr>
+        <w:t xml:space="preserve">2.2.7.2.2. </w:t>
+      </w:r>
+      <w:r>
+        <w:rPr>
+          <w:rFonts w:asciiTheme="minorHAnsi" w:hAnsiTheme="minorHAnsi" w:cstheme="minorHAnsi"/>
+          <w:b/>
+          <w:bCs/>
+        </w:rPr>
+        <w:t>Right to Record Interview Session:</w:t>
+      </w:r>
+    </w:p>
+    <w:p>
+      <w:pPr>
+        <w:pStyle w:val="NoSpacing"/>
+        <w:jc w:val="both"/>
+        <w:rPr>
+          <w:rFonts w:asciiTheme="minorHAnsi" w:hAnsiTheme="minorHAnsi" w:cstheme="minorHAnsi"/>
+          <w:b/>
+          <w:bCs/>
+        </w:rPr>
+      </w:pPr>
+    </w:p>
+    <w:p>
+      <w:pPr>
+        <w:pStyle w:val="NoSpacing"/>
+        <w:jc w:val="both"/>
+        <w:rPr>
+          <w:rFonts w:asciiTheme="minorHAnsi" w:hAnsiTheme="minorHAnsi" w:cstheme="minorHAnsi"/>
+        </w:rPr>
+      </w:pPr>
+      <w:r>
+        <w:rPr>
+          <w:rFonts w:asciiTheme="minorHAnsi" w:hAnsiTheme="minorHAnsi" w:cstheme="minorHAnsi"/>
+        </w:rPr>
+        <w:t>Candidates may request permission to record the session (audio or video) or take comprehensive written notes for their own review. This promotes:</w:t>
+      </w:r>
+    </w:p>
+    <w:p>
+      <w:pPr>
+        <w:pStyle w:val="NoSpacing"/>
+        <w:jc w:val="both"/>
+        <w:rPr>
+          <w:rFonts w:asciiTheme="minorHAnsi" w:hAnsiTheme="minorHAnsi" w:cstheme="minorHAnsi"/>
+        </w:rPr>
+      </w:pPr>
+    </w:p>
+    <w:p>
+      <w:pPr>
+        <w:pStyle w:val="NoSpacing"/>
+        <w:numPr>
+          <w:ilvl w:val="0"/>
+          <w:numId w:val="17"/>
+        </w:numPr>
+        <w:jc w:val="both"/>
+        <w:rPr>
+          <w:rFonts w:asciiTheme="minorHAnsi" w:hAnsiTheme="minorHAnsi" w:cstheme="minorHAnsi"/>
+        </w:rPr>
+      </w:pPr>
+      <w:r>
+        <w:rPr>
+          <w:rFonts w:asciiTheme="minorHAnsi" w:hAnsiTheme="minorHAnsi" w:cstheme="minorHAnsi"/>
+        </w:rPr>
+        <w:t>Personal reflection and self-improvement.</w:t>
+      </w:r>
+    </w:p>
+    <w:p>
+      <w:pPr>
+        <w:pStyle w:val="NoSpacing"/>
+        <w:jc w:val="both"/>
+        <w:rPr>
+          <w:rFonts w:asciiTheme="minorHAnsi" w:hAnsiTheme="minorHAnsi" w:cstheme="minorHAnsi"/>
+        </w:rPr>
+      </w:pPr>
+    </w:p>
+    <w:p>
+      <w:pPr>
+        <w:pStyle w:val="NoSpacing"/>
+        <w:numPr>
+          <w:ilvl w:val="0"/>
+          <w:numId w:val="17"/>
+        </w:numPr>
+        <w:jc w:val="both"/>
+        <w:rPr>
+          <w:rFonts w:asciiTheme="minorHAnsi" w:hAnsiTheme="minorHAnsi" w:cstheme="minorHAnsi"/>
+        </w:rPr>
+      </w:pPr>
+      <w:r>
+        <w:rPr>
+          <w:rFonts w:asciiTheme="minorHAnsi" w:hAnsiTheme="minorHAnsi" w:cstheme="minorHAnsi"/>
+        </w:rPr>
+        <w:t>Transparency in the assessment process.</w:t>
+      </w:r>
+    </w:p>
+    <w:p>
+      <w:pPr>
+        <w:pStyle w:val="NoSpacing"/>
+        <w:jc w:val="both"/>
+        <w:rPr>
+          <w:rFonts w:asciiTheme="minorHAnsi" w:hAnsiTheme="minorHAnsi" w:cstheme="minorHAnsi"/>
+        </w:rPr>
+      </w:pPr>
+    </w:p>
+    <w:p>
+      <w:pPr>
+        <w:pStyle w:val="NoSpacing"/>
+        <w:numPr>
+          <w:ilvl w:val="0"/>
+          <w:numId w:val="17"/>
+        </w:numPr>
+        <w:jc w:val="both"/>
+        <w:rPr>
+          <w:rFonts w:asciiTheme="minorHAnsi" w:hAnsiTheme="minorHAnsi" w:cstheme="minorHAnsi"/>
+        </w:rPr>
+      </w:pPr>
+      <w:r>
+        <w:rPr>
+          <w:rFonts w:asciiTheme="minorHAnsi" w:hAnsiTheme="minorHAnsi" w:cstheme="minorHAnsi"/>
+        </w:rPr>
+        <w:t>A record in case of disputes or appeal.</w:t>
+      </w:r>
+    </w:p>
+    <w:p>
+      <w:pPr>
+        <w:pStyle w:val="NoSpacing"/>
+        <w:jc w:val="both"/>
+        <w:rPr>
+          <w:rFonts w:asciiTheme="minorHAnsi" w:hAnsiTheme="minorHAnsi" w:cstheme="minorHAnsi"/>
+        </w:rPr>
+      </w:pPr>
+    </w:p>
+    <w:p>
+      <w:pPr>
+        <w:pStyle w:val="NoSpacing"/>
+        <w:jc w:val="both"/>
+        <w:rPr>
+          <w:rFonts w:asciiTheme="minorHAnsi" w:hAnsiTheme="minorHAnsi" w:cstheme="minorHAnsi"/>
+          <w:b/>
+          <w:bCs/>
+        </w:rPr>
+      </w:pPr>
+      <w:r>
+        <w:rPr>
+          <w:rFonts w:asciiTheme="minorHAnsi" w:hAnsiTheme="minorHAnsi" w:cstheme="minorHAnsi"/>
+          <w:b/>
+          <w:bCs/>
+        </w:rPr>
+        <w:t xml:space="preserve">2.2.7.2.3. </w:t>
+      </w:r>
+      <w:r>
+        <w:rPr>
+          <w:rFonts w:asciiTheme="minorHAnsi" w:hAnsiTheme="minorHAnsi" w:cstheme="minorHAnsi"/>
+          <w:b/>
+          <w:bCs/>
+        </w:rPr>
+        <w:t>Evaluator Obligation:</w:t>
+      </w:r>
+    </w:p>
+    <w:p>
+      <w:pPr>
+        <w:pStyle w:val="NoSpacing"/>
+        <w:jc w:val="both"/>
+        <w:rPr>
+          <w:rFonts w:asciiTheme="minorHAnsi" w:hAnsiTheme="minorHAnsi" w:cstheme="minorHAnsi"/>
+          <w:b/>
+          <w:bCs/>
+        </w:rPr>
+      </w:pPr>
+    </w:p>
+    <w:p>
+      <w:pPr>
+        <w:pStyle w:val="NoSpacing"/>
+        <w:jc w:val="both"/>
+        <w:rPr>
+          <w:rFonts w:asciiTheme="minorHAnsi" w:hAnsiTheme="minorHAnsi" w:cstheme="minorHAnsi"/>
+        </w:rPr>
+      </w:pPr>
+      <w:r>
+        <w:rPr>
+          <w:rFonts w:asciiTheme="minorHAnsi" w:hAnsiTheme="minorHAnsi" w:cstheme="minorHAnsi"/>
+        </w:rPr>
+        <w:t>Evaluators must not obstruct reasonable efforts by candidates to document the session, unless restricted by company security policies (which must be declared in advance).</w:t>
+      </w:r>
+    </w:p>
+    <w:p>
+      <w:pPr>
+        <w:pStyle w:val="NoSpacing"/>
+        <w:jc w:val="both"/>
+        <w:rPr>
+          <w:rFonts w:asciiTheme="minorHAnsi" w:hAnsiTheme="minorHAnsi" w:cstheme="minorHAnsi"/>
+        </w:rPr>
+      </w:pPr>
+    </w:p>
+    <w:p>
+      <w:pPr>
+        <w:pStyle w:val="NoSpacing"/>
+        <w:jc w:val="both"/>
+        <w:rPr>
+          <w:rFonts w:asciiTheme="minorHAnsi" w:hAnsiTheme="minorHAnsi" w:cstheme="minorHAnsi"/>
+          <w:b/>
+          <w:bCs/>
+        </w:rPr>
+      </w:pPr>
+      <w:r>
+        <w:rPr>
+          <w:rFonts w:asciiTheme="minorHAnsi" w:hAnsiTheme="minorHAnsi" w:cstheme="minorHAnsi"/>
+          <w:b/>
+          <w:bCs/>
+        </w:rPr>
+        <w:t xml:space="preserve">2.2.7.2.4. </w:t>
+      </w:r>
+      <w:r>
+        <w:rPr>
+          <w:rFonts w:asciiTheme="minorHAnsi" w:hAnsiTheme="minorHAnsi" w:cstheme="minorHAnsi"/>
+          <w:b/>
+          <w:bCs/>
+        </w:rPr>
+        <w:t>Rationale:</w:t>
+      </w:r>
+    </w:p>
+    <w:p>
+      <w:pPr>
+        <w:pStyle w:val="NoSpacing"/>
+        <w:jc w:val="both"/>
+        <w:rPr>
+          <w:rFonts w:asciiTheme="minorHAnsi" w:hAnsiTheme="minorHAnsi" w:cstheme="minorHAnsi"/>
+        </w:rPr>
+      </w:pPr>
+    </w:p>
+    <w:p>
+      <w:pPr>
+        <w:pStyle w:val="NoSpacing"/>
+        <w:jc w:val="both"/>
+        <w:rPr>
+          <w:rFonts w:asciiTheme="minorHAnsi" w:hAnsiTheme="minorHAnsi" w:cstheme="minorHAnsi"/>
+        </w:rPr>
+      </w:pPr>
+      <w:r>
+        <w:rPr>
+          <w:rFonts w:asciiTheme="minorHAnsi" w:hAnsiTheme="minorHAnsi" w:cstheme="minorHAnsi"/>
+        </w:rPr>
+        <w:t>Enabling candidates to document their interview experience—through AI tools or recordings—supports transparency, self-improvement, and equal access, especially for neurodiverse individuals or non-native speakers who may benefit from reviewing complex exchanges.</w:t>
+      </w:r>
+    </w:p>
+    <w:p>
+      <w:pPr>
+        <w:pStyle w:val="NoSpacing"/>
+        <w:jc w:val="both"/>
+        <w:rPr>
+          <w:rFonts w:asciiTheme="minorHAnsi" w:hAnsiTheme="minorHAnsi" w:cstheme="minorHAnsi"/>
+        </w:rPr>
+      </w:pPr>
+    </w:p>
+    <w:p>
+      <w:pPr>
+        <w:pStyle w:val="NoSpacing"/>
+        <w:jc w:val="both"/>
+        <w:rPr>
+          <w:rFonts w:asciiTheme="minorHAnsi" w:hAnsiTheme="minorHAnsi" w:cstheme="minorHAnsi"/>
+          <w:b/>
+          <w:bCs/>
           <w:color w:val="538135" w:themeColor="accent6" w:themeShade="BF"/>
           <w:sz w:val="24"/>
           <w:szCs w:val="28"/>
@@ -2407,6 +3340,7 @@
           <w:b/>
           <w:bCs/>
         </w:rPr>
+        <w:lastRenderedPageBreak/>
         <w:t xml:space="preserve">Article </w:t>
       </w:r>
       <w:r>
@@ -2803,7 +3737,6 @@
         <w:rPr>
           <w:rFonts w:asciiTheme="minorHAnsi" w:hAnsiTheme="minorHAnsi" w:cstheme="minorHAnsi"/>
         </w:rPr>
-        <w:lastRenderedPageBreak/>
         <w:t>Programming language proficiency</w:t>
       </w:r>
     </w:p>
@@ -3492,6 +4425,7 @@
           <w:b/>
           <w:bCs/>
         </w:rPr>
+        <w:lastRenderedPageBreak/>
         <w:t xml:space="preserve">Article </w:t>
       </w:r>
       <w:r>
@@ -3891,7 +4825,6 @@
           <w:b/>
           <w:bCs/>
         </w:rPr>
-        <w:lastRenderedPageBreak/>
         <w:t xml:space="preserve">Article </w:t>
       </w:r>
       <w:r>
@@ -4311,6 +5244,7 @@
           <w:b/>
           <w:bCs/>
         </w:rPr>
+        <w:lastRenderedPageBreak/>
         <w:t xml:space="preserve">Article </w:t>
       </w:r>
       <w:r>
@@ -4744,7 +5678,6 @@
           <w:sz w:val="22"/>
           <w:szCs w:val="24"/>
         </w:rPr>
-        <w:lastRenderedPageBreak/>
         <w:t>7.3 Right to Document the Assessment</w:t>
       </w:r>
     </w:p>
@@ -4885,15 +5818,7 @@
           <w:b/>
           <w:bCs/>
         </w:rPr>
-        <w:t xml:space="preserve">Article </w:t>
-      </w:r>
-      <w:r>
-        <w:rPr>
-          <w:rFonts w:asciiTheme="minorHAnsi" w:hAnsiTheme="minorHAnsi" w:cstheme="minorHAnsi"/>
-          <w:b/>
-          <w:bCs/>
-        </w:rPr>
-        <w:t>7.3.1.3</w:t>
+        <w:t>Article 7.3.1.3</w:t>
       </w:r>
       <w:r>
         <w:rPr>
@@ -4932,15 +5857,7 @@
           <w:b/>
           <w:bCs/>
         </w:rPr>
-        <w:t xml:space="preserve">Article </w:t>
-      </w:r>
-      <w:r>
-        <w:rPr>
-          <w:rFonts w:asciiTheme="minorHAnsi" w:hAnsiTheme="minorHAnsi" w:cstheme="minorHAnsi"/>
-          <w:b/>
-          <w:bCs/>
-        </w:rPr>
-        <w:t>7.3.1.4</w:t>
+        <w:t>Article 7.3.1.4</w:t>
       </w:r>
       <w:r>
         <w:rPr>
@@ -4979,15 +5896,7 @@
           <w:b/>
           <w:bCs/>
         </w:rPr>
-        <w:t xml:space="preserve">Article </w:t>
-      </w:r>
-      <w:r>
-        <w:rPr>
-          <w:rFonts w:asciiTheme="minorHAnsi" w:hAnsiTheme="minorHAnsi" w:cstheme="minorHAnsi"/>
-          <w:b/>
-          <w:bCs/>
-        </w:rPr>
-        <w:t>7.3.1.5</w:t>
+        <w:t>Article 7.3.1.5</w:t>
       </w:r>
       <w:r>
         <w:rPr>
@@ -5776,6 +6685,345 @@
     </w:lvl>
   </w:abstractNum>
   <w:abstractNum w:abstractNumId="4" w15:restartNumberingAfterBreak="0">
+    <w:nsid w:val="4329455C"/>
+    <w:multiLevelType w:val="hybridMultilevel"/>
+    <w:tmpl w:val="1CC87E76"/>
+    <w:lvl w:ilvl="0" w:tplc="88188EA8">
+      <w:start w:val="2"/>
+      <w:numFmt w:val="bullet"/>
+      <w:lvlText w:val="-"/>
+      <w:lvlJc w:val="left"/>
+      <w:pPr>
+        <w:ind w:left="720" w:hanging="360"/>
+      </w:pPr>
+      <w:rPr>
+        <w:rFonts w:ascii="Calibri" w:eastAsiaTheme="minorHAnsi" w:hAnsi="Calibri" w:cs="Calibri" w:hint="default"/>
+      </w:rPr>
+    </w:lvl>
+    <w:lvl w:ilvl="1" w:tplc="04090003" w:tentative="1">
+      <w:start w:val="1"/>
+      <w:numFmt w:val="bullet"/>
+      <w:lvlText w:val="o"/>
+      <w:lvlJc w:val="left"/>
+      <w:pPr>
+        <w:ind w:left="1440" w:hanging="360"/>
+      </w:pPr>
+      <w:rPr>
+        <w:rFonts w:ascii="Courier New" w:hAnsi="Courier New" w:cs="Courier New" w:hint="default"/>
+      </w:rPr>
+    </w:lvl>
+    <w:lvl w:ilvl="2" w:tplc="04090005" w:tentative="1">
+      <w:start w:val="1"/>
+      <w:numFmt w:val="bullet"/>
+      <w:lvlText w:val=""/>
+      <w:lvlJc w:val="left"/>
+      <w:pPr>
+        <w:ind w:left="2160" w:hanging="360"/>
+      </w:pPr>
+      <w:rPr>
+        <w:rFonts w:ascii="Wingdings" w:hAnsi="Wingdings" w:hint="default"/>
+      </w:rPr>
+    </w:lvl>
+    <w:lvl w:ilvl="3" w:tplc="04090001" w:tentative="1">
+      <w:start w:val="1"/>
+      <w:numFmt w:val="bullet"/>
+      <w:lvlText w:val=""/>
+      <w:lvlJc w:val="left"/>
+      <w:pPr>
+        <w:ind w:left="2880" w:hanging="360"/>
+      </w:pPr>
+      <w:rPr>
+        <w:rFonts w:ascii="Symbol" w:hAnsi="Symbol" w:hint="default"/>
+      </w:rPr>
+    </w:lvl>
+    <w:lvl w:ilvl="4" w:tplc="04090003" w:tentative="1">
+      <w:start w:val="1"/>
+      <w:numFmt w:val="bullet"/>
+      <w:lvlText w:val="o"/>
+      <w:lvlJc w:val="left"/>
+      <w:pPr>
+        <w:ind w:left="3600" w:hanging="360"/>
+      </w:pPr>
+      <w:rPr>
+        <w:rFonts w:ascii="Courier New" w:hAnsi="Courier New" w:cs="Courier New" w:hint="default"/>
+      </w:rPr>
+    </w:lvl>
+    <w:lvl w:ilvl="5" w:tplc="04090005" w:tentative="1">
+      <w:start w:val="1"/>
+      <w:numFmt w:val="bullet"/>
+      <w:lvlText w:val=""/>
+      <w:lvlJc w:val="left"/>
+      <w:pPr>
+        <w:ind w:left="4320" w:hanging="360"/>
+      </w:pPr>
+      <w:rPr>
+        <w:rFonts w:ascii="Wingdings" w:hAnsi="Wingdings" w:hint="default"/>
+      </w:rPr>
+    </w:lvl>
+    <w:lvl w:ilvl="6" w:tplc="04090001" w:tentative="1">
+      <w:start w:val="1"/>
+      <w:numFmt w:val="bullet"/>
+      <w:lvlText w:val=""/>
+      <w:lvlJc w:val="left"/>
+      <w:pPr>
+        <w:ind w:left="5040" w:hanging="360"/>
+      </w:pPr>
+      <w:rPr>
+        <w:rFonts w:ascii="Symbol" w:hAnsi="Symbol" w:hint="default"/>
+      </w:rPr>
+    </w:lvl>
+    <w:lvl w:ilvl="7" w:tplc="04090003" w:tentative="1">
+      <w:start w:val="1"/>
+      <w:numFmt w:val="bullet"/>
+      <w:lvlText w:val="o"/>
+      <w:lvlJc w:val="left"/>
+      <w:pPr>
+        <w:ind w:left="5760" w:hanging="360"/>
+      </w:pPr>
+      <w:rPr>
+        <w:rFonts w:ascii="Courier New" w:hAnsi="Courier New" w:cs="Courier New" w:hint="default"/>
+      </w:rPr>
+    </w:lvl>
+    <w:lvl w:ilvl="8" w:tplc="04090005" w:tentative="1">
+      <w:start w:val="1"/>
+      <w:numFmt w:val="bullet"/>
+      <w:lvlText w:val=""/>
+      <w:lvlJc w:val="left"/>
+      <w:pPr>
+        <w:ind w:left="6480" w:hanging="360"/>
+      </w:pPr>
+      <w:rPr>
+        <w:rFonts w:ascii="Wingdings" w:hAnsi="Wingdings" w:hint="default"/>
+      </w:rPr>
+    </w:lvl>
+  </w:abstractNum>
+  <w:abstractNum w:abstractNumId="5" w15:restartNumberingAfterBreak="0">
+    <w:nsid w:val="438741A5"/>
+    <w:multiLevelType w:val="hybridMultilevel"/>
+    <w:tmpl w:val="412EF590"/>
+    <w:lvl w:ilvl="0" w:tplc="88188EA8">
+      <w:start w:val="2"/>
+      <w:numFmt w:val="bullet"/>
+      <w:lvlText w:val="-"/>
+      <w:lvlJc w:val="left"/>
+      <w:pPr>
+        <w:ind w:left="720" w:hanging="360"/>
+      </w:pPr>
+      <w:rPr>
+        <w:rFonts w:ascii="Calibri" w:eastAsiaTheme="minorHAnsi" w:hAnsi="Calibri" w:cs="Calibri" w:hint="default"/>
+      </w:rPr>
+    </w:lvl>
+    <w:lvl w:ilvl="1" w:tplc="04090003" w:tentative="1">
+      <w:start w:val="1"/>
+      <w:numFmt w:val="bullet"/>
+      <w:lvlText w:val="o"/>
+      <w:lvlJc w:val="left"/>
+      <w:pPr>
+        <w:ind w:left="1440" w:hanging="360"/>
+      </w:pPr>
+      <w:rPr>
+        <w:rFonts w:ascii="Courier New" w:hAnsi="Courier New" w:cs="Courier New" w:hint="default"/>
+      </w:rPr>
+    </w:lvl>
+    <w:lvl w:ilvl="2" w:tplc="04090005" w:tentative="1">
+      <w:start w:val="1"/>
+      <w:numFmt w:val="bullet"/>
+      <w:lvlText w:val=""/>
+      <w:lvlJc w:val="left"/>
+      <w:pPr>
+        <w:ind w:left="2160" w:hanging="360"/>
+      </w:pPr>
+      <w:rPr>
+        <w:rFonts w:ascii="Wingdings" w:hAnsi="Wingdings" w:hint="default"/>
+      </w:rPr>
+    </w:lvl>
+    <w:lvl w:ilvl="3" w:tplc="04090001" w:tentative="1">
+      <w:start w:val="1"/>
+      <w:numFmt w:val="bullet"/>
+      <w:lvlText w:val=""/>
+      <w:lvlJc w:val="left"/>
+      <w:pPr>
+        <w:ind w:left="2880" w:hanging="360"/>
+      </w:pPr>
+      <w:rPr>
+        <w:rFonts w:ascii="Symbol" w:hAnsi="Symbol" w:hint="default"/>
+      </w:rPr>
+    </w:lvl>
+    <w:lvl w:ilvl="4" w:tplc="04090003" w:tentative="1">
+      <w:start w:val="1"/>
+      <w:numFmt w:val="bullet"/>
+      <w:lvlText w:val="o"/>
+      <w:lvlJc w:val="left"/>
+      <w:pPr>
+        <w:ind w:left="3600" w:hanging="360"/>
+      </w:pPr>
+      <w:rPr>
+        <w:rFonts w:ascii="Courier New" w:hAnsi="Courier New" w:cs="Courier New" w:hint="default"/>
+      </w:rPr>
+    </w:lvl>
+    <w:lvl w:ilvl="5" w:tplc="04090005" w:tentative="1">
+      <w:start w:val="1"/>
+      <w:numFmt w:val="bullet"/>
+      <w:lvlText w:val=""/>
+      <w:lvlJc w:val="left"/>
+      <w:pPr>
+        <w:ind w:left="4320" w:hanging="360"/>
+      </w:pPr>
+      <w:rPr>
+        <w:rFonts w:ascii="Wingdings" w:hAnsi="Wingdings" w:hint="default"/>
+      </w:rPr>
+    </w:lvl>
+    <w:lvl w:ilvl="6" w:tplc="04090001" w:tentative="1">
+      <w:start w:val="1"/>
+      <w:numFmt w:val="bullet"/>
+      <w:lvlText w:val=""/>
+      <w:lvlJc w:val="left"/>
+      <w:pPr>
+        <w:ind w:left="5040" w:hanging="360"/>
+      </w:pPr>
+      <w:rPr>
+        <w:rFonts w:ascii="Symbol" w:hAnsi="Symbol" w:hint="default"/>
+      </w:rPr>
+    </w:lvl>
+    <w:lvl w:ilvl="7" w:tplc="04090003" w:tentative="1">
+      <w:start w:val="1"/>
+      <w:numFmt w:val="bullet"/>
+      <w:lvlText w:val="o"/>
+      <w:lvlJc w:val="left"/>
+      <w:pPr>
+        <w:ind w:left="5760" w:hanging="360"/>
+      </w:pPr>
+      <w:rPr>
+        <w:rFonts w:ascii="Courier New" w:hAnsi="Courier New" w:cs="Courier New" w:hint="default"/>
+      </w:rPr>
+    </w:lvl>
+    <w:lvl w:ilvl="8" w:tplc="04090005" w:tentative="1">
+      <w:start w:val="1"/>
+      <w:numFmt w:val="bullet"/>
+      <w:lvlText w:val=""/>
+      <w:lvlJc w:val="left"/>
+      <w:pPr>
+        <w:ind w:left="6480" w:hanging="360"/>
+      </w:pPr>
+      <w:rPr>
+        <w:rFonts w:ascii="Wingdings" w:hAnsi="Wingdings" w:hint="default"/>
+      </w:rPr>
+    </w:lvl>
+  </w:abstractNum>
+  <w:abstractNum w:abstractNumId="6" w15:restartNumberingAfterBreak="0">
+    <w:nsid w:val="4ADE6640"/>
+    <w:multiLevelType w:val="hybridMultilevel"/>
+    <w:tmpl w:val="4F90BB06"/>
+    <w:lvl w:ilvl="0" w:tplc="88188EA8">
+      <w:start w:val="2"/>
+      <w:numFmt w:val="bullet"/>
+      <w:lvlText w:val="-"/>
+      <w:lvlJc w:val="left"/>
+      <w:pPr>
+        <w:ind w:left="720" w:hanging="360"/>
+      </w:pPr>
+      <w:rPr>
+        <w:rFonts w:ascii="Calibri" w:eastAsiaTheme="minorHAnsi" w:hAnsi="Calibri" w:cs="Calibri" w:hint="default"/>
+      </w:rPr>
+    </w:lvl>
+    <w:lvl w:ilvl="1" w:tplc="04090003" w:tentative="1">
+      <w:start w:val="1"/>
+      <w:numFmt w:val="bullet"/>
+      <w:lvlText w:val="o"/>
+      <w:lvlJc w:val="left"/>
+      <w:pPr>
+        <w:ind w:left="1440" w:hanging="360"/>
+      </w:pPr>
+      <w:rPr>
+        <w:rFonts w:ascii="Courier New" w:hAnsi="Courier New" w:cs="Courier New" w:hint="default"/>
+      </w:rPr>
+    </w:lvl>
+    <w:lvl w:ilvl="2" w:tplc="04090005" w:tentative="1">
+      <w:start w:val="1"/>
+      <w:numFmt w:val="bullet"/>
+      <w:lvlText w:val=""/>
+      <w:lvlJc w:val="left"/>
+      <w:pPr>
+        <w:ind w:left="2160" w:hanging="360"/>
+      </w:pPr>
+      <w:rPr>
+        <w:rFonts w:ascii="Wingdings" w:hAnsi="Wingdings" w:hint="default"/>
+      </w:rPr>
+    </w:lvl>
+    <w:lvl w:ilvl="3" w:tplc="04090001" w:tentative="1">
+      <w:start w:val="1"/>
+      <w:numFmt w:val="bullet"/>
+      <w:lvlText w:val=""/>
+      <w:lvlJc w:val="left"/>
+      <w:pPr>
+        <w:ind w:left="2880" w:hanging="360"/>
+      </w:pPr>
+      <w:rPr>
+        <w:rFonts w:ascii="Symbol" w:hAnsi="Symbol" w:hint="default"/>
+      </w:rPr>
+    </w:lvl>
+    <w:lvl w:ilvl="4" w:tplc="04090003" w:tentative="1">
+      <w:start w:val="1"/>
+      <w:numFmt w:val="bullet"/>
+      <w:lvlText w:val="o"/>
+      <w:lvlJc w:val="left"/>
+      <w:pPr>
+        <w:ind w:left="3600" w:hanging="360"/>
+      </w:pPr>
+      <w:rPr>
+        <w:rFonts w:ascii="Courier New" w:hAnsi="Courier New" w:cs="Courier New" w:hint="default"/>
+      </w:rPr>
+    </w:lvl>
+    <w:lvl w:ilvl="5" w:tplc="04090005" w:tentative="1">
+      <w:start w:val="1"/>
+      <w:numFmt w:val="bullet"/>
+      <w:lvlText w:val=""/>
+      <w:lvlJc w:val="left"/>
+      <w:pPr>
+        <w:ind w:left="4320" w:hanging="360"/>
+      </w:pPr>
+      <w:rPr>
+        <w:rFonts w:ascii="Wingdings" w:hAnsi="Wingdings" w:hint="default"/>
+      </w:rPr>
+    </w:lvl>
+    <w:lvl w:ilvl="6" w:tplc="04090001" w:tentative="1">
+      <w:start w:val="1"/>
+      <w:numFmt w:val="bullet"/>
+      <w:lvlText w:val=""/>
+      <w:lvlJc w:val="left"/>
+      <w:pPr>
+        <w:ind w:left="5040" w:hanging="360"/>
+      </w:pPr>
+      <w:rPr>
+        <w:rFonts w:ascii="Symbol" w:hAnsi="Symbol" w:hint="default"/>
+      </w:rPr>
+    </w:lvl>
+    <w:lvl w:ilvl="7" w:tplc="04090003" w:tentative="1">
+      <w:start w:val="1"/>
+      <w:numFmt w:val="bullet"/>
+      <w:lvlText w:val="o"/>
+      <w:lvlJc w:val="left"/>
+      <w:pPr>
+        <w:ind w:left="5760" w:hanging="360"/>
+      </w:pPr>
+      <w:rPr>
+        <w:rFonts w:ascii="Courier New" w:hAnsi="Courier New" w:cs="Courier New" w:hint="default"/>
+      </w:rPr>
+    </w:lvl>
+    <w:lvl w:ilvl="8" w:tplc="04090005" w:tentative="1">
+      <w:start w:val="1"/>
+      <w:numFmt w:val="bullet"/>
+      <w:lvlText w:val=""/>
+      <w:lvlJc w:val="left"/>
+      <w:pPr>
+        <w:ind w:left="6480" w:hanging="360"/>
+      </w:pPr>
+      <w:rPr>
+        <w:rFonts w:ascii="Wingdings" w:hAnsi="Wingdings" w:hint="default"/>
+      </w:rPr>
+    </w:lvl>
+  </w:abstractNum>
+  <w:abstractNum w:abstractNumId="7" w15:restartNumberingAfterBreak="0">
     <w:nsid w:val="4E7D5563"/>
     <w:multiLevelType w:val="multilevel"/>
     <w:tmpl w:val="E64A30DC"/>
@@ -5924,7 +7172,7 @@
       </w:rPr>
     </w:lvl>
   </w:abstractNum>
-  <w:abstractNum w:abstractNumId="5" w15:restartNumberingAfterBreak="0">
+  <w:abstractNum w:abstractNumId="8" w15:restartNumberingAfterBreak="0">
     <w:nsid w:val="548A7E72"/>
     <w:multiLevelType w:val="multilevel"/>
     <w:tmpl w:val="3912C3D8"/>
@@ -6073,7 +7321,7 @@
       </w:rPr>
     </w:lvl>
   </w:abstractNum>
-  <w:abstractNum w:abstractNumId="6" w15:restartNumberingAfterBreak="0">
+  <w:abstractNum w:abstractNumId="9" w15:restartNumberingAfterBreak="0">
     <w:nsid w:val="57B45198"/>
     <w:multiLevelType w:val="multilevel"/>
     <w:tmpl w:val="0D222410"/>
@@ -6222,7 +7470,7 @@
       </w:rPr>
     </w:lvl>
   </w:abstractNum>
-  <w:abstractNum w:abstractNumId="7" w15:restartNumberingAfterBreak="0">
+  <w:abstractNum w:abstractNumId="10" w15:restartNumberingAfterBreak="0">
     <w:nsid w:val="58EE7031"/>
     <w:multiLevelType w:val="multilevel"/>
     <w:tmpl w:val="901268B6"/>
@@ -6371,7 +7619,7 @@
       </w:rPr>
     </w:lvl>
   </w:abstractNum>
-  <w:abstractNum w:abstractNumId="8" w15:restartNumberingAfterBreak="0">
+  <w:abstractNum w:abstractNumId="11" w15:restartNumberingAfterBreak="0">
     <w:nsid w:val="64DD4B09"/>
     <w:multiLevelType w:val="multilevel"/>
     <w:tmpl w:val="B7D267F6"/>
@@ -6520,7 +7768,7 @@
       </w:rPr>
     </w:lvl>
   </w:abstractNum>
-  <w:abstractNum w:abstractNumId="9" w15:restartNumberingAfterBreak="0">
+  <w:abstractNum w:abstractNumId="12" w15:restartNumberingAfterBreak="0">
     <w:nsid w:val="6A382216"/>
     <w:multiLevelType w:val="multilevel"/>
     <w:tmpl w:val="B030BECA"/>
@@ -6669,7 +7917,7 @@
       </w:rPr>
     </w:lvl>
   </w:abstractNum>
-  <w:abstractNum w:abstractNumId="10" w15:restartNumberingAfterBreak="0">
+  <w:abstractNum w:abstractNumId="13" w15:restartNumberingAfterBreak="0">
     <w:nsid w:val="6C44407E"/>
     <w:multiLevelType w:val="multilevel"/>
     <w:tmpl w:val="CED4569E"/>
@@ -6818,7 +8066,7 @@
       </w:rPr>
     </w:lvl>
   </w:abstractNum>
-  <w:abstractNum w:abstractNumId="11" w15:restartNumberingAfterBreak="0">
+  <w:abstractNum w:abstractNumId="14" w15:restartNumberingAfterBreak="0">
     <w:nsid w:val="6D8731C0"/>
     <w:multiLevelType w:val="multilevel"/>
     <w:tmpl w:val="AB0EB66C"/>
@@ -6967,7 +8215,7 @@
       </w:rPr>
     </w:lvl>
   </w:abstractNum>
-  <w:abstractNum w:abstractNumId="12" w15:restartNumberingAfterBreak="0">
+  <w:abstractNum w:abstractNumId="15" w15:restartNumberingAfterBreak="0">
     <w:nsid w:val="6F7776F1"/>
     <w:multiLevelType w:val="multilevel"/>
     <w:tmpl w:val="A39C3A0E"/>
@@ -7116,7 +8364,7 @@
       </w:rPr>
     </w:lvl>
   </w:abstractNum>
-  <w:abstractNum w:abstractNumId="13" w15:restartNumberingAfterBreak="0">
+  <w:abstractNum w:abstractNumId="16" w15:restartNumberingAfterBreak="0">
     <w:nsid w:val="773A3BF0"/>
     <w:multiLevelType w:val="multilevel"/>
     <w:tmpl w:val="41E09E56"/>
@@ -7266,16 +8514,16 @@
     </w:lvl>
   </w:abstractNum>
   <w:num w:numId="1">
-    <w:abstractNumId w:val="12"/>
+    <w:abstractNumId w:val="15"/>
   </w:num>
   <w:num w:numId="2">
     <w:abstractNumId w:val="2"/>
   </w:num>
   <w:num w:numId="3">
-    <w:abstractNumId w:val="5"/>
+    <w:abstractNumId w:val="8"/>
   </w:num>
   <w:num w:numId="4">
-    <w:abstractNumId w:val="11"/>
+    <w:abstractNumId w:val="14"/>
   </w:num>
   <w:num w:numId="5">
     <w:abstractNumId w:val="1"/>
@@ -7284,27 +8532,36 @@
     <w:abstractNumId w:val="0"/>
   </w:num>
   <w:num w:numId="7">
-    <w:abstractNumId w:val="13"/>
+    <w:abstractNumId w:val="16"/>
   </w:num>
   <w:num w:numId="8">
+    <w:abstractNumId w:val="12"/>
+  </w:num>
+  <w:num w:numId="9">
+    <w:abstractNumId w:val="11"/>
+  </w:num>
+  <w:num w:numId="10">
     <w:abstractNumId w:val="9"/>
   </w:num>
-  <w:num w:numId="9">
-    <w:abstractNumId w:val="8"/>
-  </w:num>
-  <w:num w:numId="10">
-    <w:abstractNumId w:val="6"/>
-  </w:num>
   <w:num w:numId="11">
-    <w:abstractNumId w:val="10"/>
+    <w:abstractNumId w:val="13"/>
   </w:num>
   <w:num w:numId="12">
     <w:abstractNumId w:val="3"/>
   </w:num>
   <w:num w:numId="13">
+    <w:abstractNumId w:val="10"/>
+  </w:num>
+  <w:num w:numId="14">
     <w:abstractNumId w:val="7"/>
   </w:num>
-  <w:num w:numId="14">
+  <w:num w:numId="15">
+    <w:abstractNumId w:val="6"/>
+  </w:num>
+  <w:num w:numId="16">
+    <w:abstractNumId w:val="5"/>
+  </w:num>
+  <w:num w:numId="17">
     <w:abstractNumId w:val="4"/>
   </w:num>
 </w:numbering>

</xml_diff>